<commit_message>
fix: regenerate FPR v1.7 full (Glossary, Figure 8, SSDF removed) and add Glossary Appendix B to guide
- FPR v1.7 now 201k docx, document.xml 175k >90k, Figure 8 embedded, 10 bibliography entries, no Appendix I, no SSDF
- Guide docx/pdf now 12 pages with Appendix B Glossary (22 terms)
- build scripts updated
</commit_message>
<xml_diff>
--- a/PROJECT_PRESENTATION_GUIDE.docx
+++ b/PROJECT_PRESENTATION_GUIDE.docx
@@ -4886,6 +4886,1100 @@
         <w:t>This is a study and presentation document derived from repository evidence. It is not a replacement for the formal project report, institutional declarations, or a signed provenance implementation.</w:t>
       </w:r>
     </w:p>
+    <w:p>
+      <w:r>
+        <w:br w:type="page"/>
+      </w:r>
+    </w:p>
+    <w:p>
+      <w:pPr>
+        <w:pStyle w:val="Heading1"/>
+        <w:keepNext/>
+      </w:pPr>
+      <w:r>
+        <w:t>Appendix B. Glossary</w:t>
+      </w:r>
+    </w:p>
+    <w:p>
+      <w:r>
+        <w:t>Terms as used in this guide and the final report (22 entries).</w:t>
+      </w:r>
+    </w:p>
+    <w:tbl>
+      <w:tblPr>
+        <w:tblStyle w:val="TableGrid"/>
+        <w:tblW w:type="auto" w:w="0"/>
+        <w:jc w:val="center"/>
+        <w:tblLook w:firstColumn="1" w:firstRow="1" w:lastColumn="0" w:lastRow="0" w:noHBand="0" w:noVBand="1" w:val="04A0"/>
+      </w:tblPr>
+      <w:tblGrid>
+        <w:gridCol w:w="4997"/>
+        <w:gridCol w:w="4997"/>
+      </w:tblGrid>
+      <w:tr>
+        <w:tc>
+          <w:tcPr>
+            <w:tcW w:type="dxa" w:w="2376"/>
+            <w:vAlign w:val="center"/>
+            <w:shd w:fill="17324D"/>
+          </w:tcPr>
+          <w:p>
+            <w:pPr>
+              <w:spacing w:after="40"/>
+            </w:pPr>
+            <w:r/>
+            <w:r>
+              <w:rPr>
+                <w:rFonts w:ascii="Aptos" w:hAnsi="Aptos"/>
+                <w:b/>
+                <w:color w:val="FFFFFF"/>
+                <w:sz w:val="17"/>
+              </w:rPr>
+              <w:t>Term</w:t>
+            </w:r>
+          </w:p>
+        </w:tc>
+        <w:tc>
+          <w:tcPr>
+            <w:tcW w:type="dxa" w:w="6552"/>
+            <w:vAlign w:val="center"/>
+            <w:shd w:fill="17324D"/>
+          </w:tcPr>
+          <w:p>
+            <w:pPr>
+              <w:spacing w:after="40"/>
+            </w:pPr>
+            <w:r/>
+            <w:r>
+              <w:rPr>
+                <w:rFonts w:ascii="Aptos" w:hAnsi="Aptos"/>
+                <w:b/>
+                <w:color w:val="FFFFFF"/>
+                <w:sz w:val="17"/>
+              </w:rPr>
+              <w:t>Definition</w:t>
+            </w:r>
+          </w:p>
+        </w:tc>
+      </w:tr>
+      <w:tr>
+        <w:tc>
+          <w:tcPr>
+            <w:tcW w:type="dxa" w:w="2376"/>
+            <w:vAlign w:val="center"/>
+            <w:shd w:fill="F3F6F8"/>
+          </w:tcPr>
+          <w:p>
+            <w:pPr>
+              <w:spacing w:after="40"/>
+            </w:pPr>
+            <w:r/>
+            <w:r>
+              <w:rPr>
+                <w:rFonts w:ascii="Aptos" w:hAnsi="Aptos"/>
+                <w:b w:val="0"/>
+                <w:color w:val="172033"/>
+                <w:sz w:val="17"/>
+              </w:rPr>
+              <w:t>Authenticity</w:t>
+            </w:r>
+          </w:p>
+        </w:tc>
+        <w:tc>
+          <w:tcPr>
+            <w:tcW w:type="dxa" w:w="6552"/>
+            <w:vAlign w:val="center"/>
+            <w:shd w:fill="F3F6F8"/>
+          </w:tcPr>
+          <w:p>
+            <w:pPr>
+              <w:spacing w:after="40"/>
+            </w:pPr>
+            <w:r/>
+            <w:r>
+              <w:rPr>
+                <w:rFonts w:ascii="Aptos" w:hAnsi="Aptos"/>
+                <w:b w:val="0"/>
+                <w:color w:val="172033"/>
+                <w:sz w:val="17"/>
+              </w:rPr>
+              <w:t>Claim that content is true or correctly attributed; not established by signal recovery alone.</w:t>
+            </w:r>
+          </w:p>
+        </w:tc>
+      </w:tr>
+      <w:tr>
+        <w:tc>
+          <w:tcPr>
+            <w:tcW w:type="dxa" w:w="2376"/>
+            <w:vAlign w:val="center"/>
+            <w:shd w:fill="FFFFFF"/>
+          </w:tcPr>
+          <w:p>
+            <w:pPr>
+              <w:spacing w:after="40"/>
+            </w:pPr>
+            <w:r/>
+            <w:r>
+              <w:rPr>
+                <w:rFonts w:ascii="Aptos" w:hAnsi="Aptos"/>
+                <w:b w:val="0"/>
+                <w:color w:val="172033"/>
+                <w:sz w:val="17"/>
+              </w:rPr>
+              <w:t>BCH</w:t>
+            </w:r>
+          </w:p>
+        </w:tc>
+        <w:tc>
+          <w:tcPr>
+            <w:tcW w:type="dxa" w:w="6552"/>
+            <w:vAlign w:val="center"/>
+            <w:shd w:fill="FFFFFF"/>
+          </w:tcPr>
+          <w:p>
+            <w:pPr>
+              <w:spacing w:after="40"/>
+            </w:pPr>
+            <w:r/>
+            <w:r>
+              <w:rPr>
+                <w:rFonts w:ascii="Aptos" w:hAnsi="Aptos"/>
+                <w:b w:val="0"/>
+                <w:color w:val="172033"/>
+                <w:sz w:val="17"/>
+              </w:rPr>
+              <w:t>Bose-Chaudhuri-Hocquenghem error-correcting code used in watermark packets.</w:t>
+            </w:r>
+          </w:p>
+        </w:tc>
+      </w:tr>
+      <w:tr>
+        <w:tc>
+          <w:tcPr>
+            <w:tcW w:type="dxa" w:w="2376"/>
+            <w:vAlign w:val="center"/>
+            <w:shd w:fill="F3F6F8"/>
+          </w:tcPr>
+          <w:p>
+            <w:pPr>
+              <w:spacing w:after="40"/>
+            </w:pPr>
+            <w:r/>
+            <w:r>
+              <w:rPr>
+                <w:rFonts w:ascii="Aptos" w:hAnsi="Aptos"/>
+                <w:b w:val="0"/>
+                <w:color w:val="172033"/>
+                <w:sz w:val="17"/>
+              </w:rPr>
+              <w:t>Bit accuracy</w:t>
+            </w:r>
+          </w:p>
+        </w:tc>
+        <w:tc>
+          <w:tcPr>
+            <w:tcW w:type="dxa" w:w="6552"/>
+            <w:vAlign w:val="center"/>
+            <w:shd w:fill="F3F6F8"/>
+          </w:tcPr>
+          <w:p>
+            <w:pPr>
+              <w:spacing w:after="40"/>
+            </w:pPr>
+            <w:r/>
+            <w:r>
+              <w:rPr>
+                <w:rFonts w:ascii="Aptos" w:hAnsi="Aptos"/>
+                <w:b w:val="0"/>
+                <w:color w:val="172033"/>
+                <w:sz w:val="17"/>
+              </w:rPr>
+              <w:t>Proportion of expected watermark bits recovered before error correction.</w:t>
+            </w:r>
+          </w:p>
+        </w:tc>
+      </w:tr>
+      <w:tr>
+        <w:tc>
+          <w:tcPr>
+            <w:tcW w:type="dxa" w:w="2376"/>
+            <w:vAlign w:val="center"/>
+            <w:shd w:fill="FFFFFF"/>
+          </w:tcPr>
+          <w:p>
+            <w:pPr>
+              <w:spacing w:after="40"/>
+            </w:pPr>
+            <w:r/>
+            <w:r>
+              <w:rPr>
+                <w:rFonts w:ascii="Aptos" w:hAnsi="Aptos"/>
+                <w:b w:val="0"/>
+                <w:color w:val="172033"/>
+                <w:sz w:val="17"/>
+              </w:rPr>
+              <w:t>Decode presence</w:t>
+            </w:r>
+          </w:p>
+        </w:tc>
+        <w:tc>
+          <w:tcPr>
+            <w:tcW w:type="dxa" w:w="6552"/>
+            <w:vAlign w:val="center"/>
+            <w:shd w:fill="FFFFFF"/>
+          </w:tcPr>
+          <w:p>
+            <w:pPr>
+              <w:spacing w:after="40"/>
+            </w:pPr>
+            <w:r/>
+            <w:r>
+              <w:rPr>
+                <w:rFonts w:ascii="Aptos" w:hAnsi="Aptos"/>
+                <w:b w:val="0"/>
+                <w:color w:val="172033"/>
+                <w:sz w:val="17"/>
+              </w:rPr>
+              <w:t>Whether the decoder reports a valid payload; distinct from raw bit accuracy.</w:t>
+            </w:r>
+          </w:p>
+        </w:tc>
+      </w:tr>
+      <w:tr>
+        <w:tc>
+          <w:tcPr>
+            <w:tcW w:type="dxa" w:w="2376"/>
+            <w:vAlign w:val="center"/>
+            <w:shd w:fill="F3F6F8"/>
+          </w:tcPr>
+          <w:p>
+            <w:pPr>
+              <w:spacing w:after="40"/>
+            </w:pPr>
+            <w:r/>
+            <w:r>
+              <w:rPr>
+                <w:rFonts w:ascii="Aptos" w:hAnsi="Aptos"/>
+                <w:b w:val="0"/>
+                <w:color w:val="172033"/>
+                <w:sz w:val="17"/>
+              </w:rPr>
+              <w:t>DCT</w:t>
+            </w:r>
+          </w:p>
+        </w:tc>
+        <w:tc>
+          <w:tcPr>
+            <w:tcW w:type="dxa" w:w="6552"/>
+            <w:vAlign w:val="center"/>
+            <w:shd w:fill="F3F6F8"/>
+          </w:tcPr>
+          <w:p>
+            <w:pPr>
+              <w:spacing w:after="40"/>
+            </w:pPr>
+            <w:r/>
+            <w:r>
+              <w:rPr>
+                <w:rFonts w:ascii="Aptos" w:hAnsi="Aptos"/>
+                <w:b w:val="0"/>
+                <w:color w:val="172033"/>
+                <w:sz w:val="17"/>
+              </w:rPr>
+              <w:t>Discrete cosine transform; frequency-domain baseline embedding in mid-frequency coefficients.</w:t>
+            </w:r>
+          </w:p>
+        </w:tc>
+      </w:tr>
+      <w:tr>
+        <w:tc>
+          <w:tcPr>
+            <w:tcW w:type="dxa" w:w="2376"/>
+            <w:vAlign w:val="center"/>
+            <w:shd w:fill="FFFFFF"/>
+          </w:tcPr>
+          <w:p>
+            <w:pPr>
+              <w:spacing w:after="40"/>
+            </w:pPr>
+            <w:r/>
+            <w:r>
+              <w:rPr>
+                <w:rFonts w:ascii="Aptos" w:hAnsi="Aptos"/>
+                <w:b w:val="0"/>
+                <w:color w:val="172033"/>
+                <w:sz w:val="17"/>
+              </w:rPr>
+              <w:t>ECC</w:t>
+            </w:r>
+          </w:p>
+        </w:tc>
+        <w:tc>
+          <w:tcPr>
+            <w:tcW w:type="dxa" w:w="6552"/>
+            <w:vAlign w:val="center"/>
+            <w:shd w:fill="FFFFFF"/>
+          </w:tcPr>
+          <w:p>
+            <w:pPr>
+              <w:spacing w:after="40"/>
+            </w:pPr>
+            <w:r/>
+            <w:r>
+              <w:rPr>
+                <w:rFonts w:ascii="Aptos" w:hAnsi="Aptos"/>
+                <w:b w:val="0"/>
+                <w:color w:val="172033"/>
+                <w:sz w:val="17"/>
+              </w:rPr>
+              <w:t>Error-correcting code; converts partial bit recovery into valid messages.</w:t>
+            </w:r>
+          </w:p>
+        </w:tc>
+      </w:tr>
+      <w:tr>
+        <w:tc>
+          <w:tcPr>
+            <w:tcW w:type="dxa" w:w="2376"/>
+            <w:vAlign w:val="center"/>
+            <w:shd w:fill="F3F6F8"/>
+          </w:tcPr>
+          <w:p>
+            <w:pPr>
+              <w:spacing w:after="40"/>
+            </w:pPr>
+            <w:r/>
+            <w:r>
+              <w:rPr>
+                <w:rFonts w:ascii="Aptos" w:hAnsi="Aptos"/>
+                <w:b w:val="0"/>
+                <w:color w:val="172033"/>
+                <w:sz w:val="17"/>
+              </w:rPr>
+              <w:t>Ensemble</w:t>
+            </w:r>
+          </w:p>
+        </w:tc>
+        <w:tc>
+          <w:tcPr>
+            <w:tcW w:type="dxa" w:w="6552"/>
+            <w:vAlign w:val="center"/>
+            <w:shd w:fill="F3F6F8"/>
+          </w:tcPr>
+          <w:p>
+            <w:pPr>
+              <w:spacing w:after="40"/>
+            </w:pPr>
+            <w:r/>
+            <w:r>
+              <w:rPr>
+                <w:rFonts w:ascii="Aptos" w:hAnsi="Aptos"/>
+                <w:b w:val="0"/>
+                <w:color w:val="172033"/>
+                <w:sz w:val="17"/>
+              </w:rPr>
+              <w:t>Decision matrix combining hash and watermark signals per condition.</w:t>
+            </w:r>
+          </w:p>
+        </w:tc>
+      </w:tr>
+      <w:tr>
+        <w:tc>
+          <w:tcPr>
+            <w:tcW w:type="dxa" w:w="2376"/>
+            <w:vAlign w:val="center"/>
+            <w:shd w:fill="FFFFFF"/>
+          </w:tcPr>
+          <w:p>
+            <w:pPr>
+              <w:spacing w:after="40"/>
+            </w:pPr>
+            <w:r/>
+            <w:r>
+              <w:rPr>
+                <w:rFonts w:ascii="Aptos" w:hAnsi="Aptos"/>
+                <w:b w:val="0"/>
+                <w:color w:val="172033"/>
+                <w:sz w:val="17"/>
+              </w:rPr>
+              <w:t>False acceptance</w:t>
+            </w:r>
+          </w:p>
+        </w:tc>
+        <w:tc>
+          <w:tcPr>
+            <w:tcW w:type="dxa" w:w="6552"/>
+            <w:vAlign w:val="center"/>
+            <w:shd w:fill="FFFFFF"/>
+          </w:tcPr>
+          <w:p>
+            <w:pPr>
+              <w:spacing w:after="40"/>
+            </w:pPr>
+            <w:r/>
+            <w:r>
+              <w:rPr>
+                <w:rFonts w:ascii="Aptos" w:hAnsi="Aptos"/>
+                <w:b w:val="0"/>
+                <w:color w:val="172033"/>
+                <w:sz w:val="17"/>
+              </w:rPr>
+              <w:t>Accepting an unrelated or incorrectly watermarked image as verified.</w:t>
+            </w:r>
+          </w:p>
+        </w:tc>
+      </w:tr>
+      <w:tr>
+        <w:tc>
+          <w:tcPr>
+            <w:tcW w:type="dxa" w:w="2376"/>
+            <w:vAlign w:val="center"/>
+            <w:shd w:fill="F3F6F8"/>
+          </w:tcPr>
+          <w:p>
+            <w:pPr>
+              <w:spacing w:after="40"/>
+            </w:pPr>
+            <w:r/>
+            <w:r>
+              <w:rPr>
+                <w:rFonts w:ascii="Aptos" w:hAnsi="Aptos"/>
+                <w:b w:val="0"/>
+                <w:color w:val="172033"/>
+                <w:sz w:val="17"/>
+              </w:rPr>
+              <w:t>Hamming distance</w:t>
+            </w:r>
+          </w:p>
+        </w:tc>
+        <w:tc>
+          <w:tcPr>
+            <w:tcW w:type="dxa" w:w="6552"/>
+            <w:vAlign w:val="center"/>
+            <w:shd w:fill="F3F6F8"/>
+          </w:tcPr>
+          <w:p>
+            <w:pPr>
+              <w:spacing w:after="40"/>
+            </w:pPr>
+            <w:r/>
+            <w:r>
+              <w:rPr>
+                <w:rFonts w:ascii="Aptos" w:hAnsi="Aptos"/>
+                <w:b w:val="0"/>
+                <w:color w:val="172033"/>
+                <w:sz w:val="17"/>
+              </w:rPr>
+              <w:t>Number of differing bits between reference and transformed hash.</w:t>
+            </w:r>
+          </w:p>
+        </w:tc>
+      </w:tr>
+      <w:tr>
+        <w:tc>
+          <w:tcPr>
+            <w:tcW w:type="dxa" w:w="2376"/>
+            <w:vAlign w:val="center"/>
+            <w:shd w:fill="FFFFFF"/>
+          </w:tcPr>
+          <w:p>
+            <w:pPr>
+              <w:spacing w:after="40"/>
+            </w:pPr>
+            <w:r/>
+            <w:r>
+              <w:rPr>
+                <w:rFonts w:ascii="Aptos" w:hAnsi="Aptos"/>
+                <w:b w:val="0"/>
+                <w:color w:val="172033"/>
+                <w:sz w:val="17"/>
+              </w:rPr>
+              <w:t>Integrity</w:t>
+            </w:r>
+          </w:p>
+        </w:tc>
+        <w:tc>
+          <w:tcPr>
+            <w:tcW w:type="dxa" w:w="6552"/>
+            <w:vAlign w:val="center"/>
+            <w:shd w:fill="FFFFFF"/>
+          </w:tcPr>
+          <w:p>
+            <w:pPr>
+              <w:spacing w:after="40"/>
+            </w:pPr>
+            <w:r/>
+            <w:r>
+              <w:rPr>
+                <w:rFonts w:ascii="Aptos" w:hAnsi="Aptos"/>
+                <w:b w:val="0"/>
+                <w:color w:val="172033"/>
+                <w:sz w:val="17"/>
+              </w:rPr>
+              <w:t>Evidence that bytes or content are unchanged; requires hard binding.</w:t>
+            </w:r>
+          </w:p>
+        </w:tc>
+      </w:tr>
+      <w:tr>
+        <w:tc>
+          <w:tcPr>
+            <w:tcW w:type="dxa" w:w="2376"/>
+            <w:vAlign w:val="center"/>
+            <w:shd w:fill="F3F6F8"/>
+          </w:tcPr>
+          <w:p>
+            <w:pPr>
+              <w:spacing w:after="40"/>
+            </w:pPr>
+            <w:r/>
+            <w:r>
+              <w:rPr>
+                <w:rFonts w:ascii="Aptos" w:hAnsi="Aptos"/>
+                <w:b w:val="0"/>
+                <w:color w:val="172033"/>
+                <w:sz w:val="17"/>
+              </w:rPr>
+              <w:t>Letterbox</w:t>
+            </w:r>
+          </w:p>
+        </w:tc>
+        <w:tc>
+          <w:tcPr>
+            <w:tcW w:type="dxa" w:w="6552"/>
+            <w:vAlign w:val="center"/>
+            <w:shd w:fill="F3F6F8"/>
+          </w:tcPr>
+          <w:p>
+            <w:pPr>
+              <w:spacing w:after="40"/>
+            </w:pPr>
+            <w:r/>
+            <w:r>
+              <w:rPr>
+                <w:rFonts w:ascii="Aptos" w:hAnsi="Aptos"/>
+                <w:b w:val="0"/>
+                <w:color w:val="172033"/>
+                <w:sz w:val="17"/>
+              </w:rPr>
+              <w:t>Padding added to preserve aspect ratio; separate from cropping.</w:t>
+            </w:r>
+          </w:p>
+        </w:tc>
+      </w:tr>
+      <w:tr>
+        <w:tc>
+          <w:tcPr>
+            <w:tcW w:type="dxa" w:w="2376"/>
+            <w:vAlign w:val="center"/>
+            <w:shd w:fill="FFFFFF"/>
+          </w:tcPr>
+          <w:p>
+            <w:pPr>
+              <w:spacing w:after="40"/>
+            </w:pPr>
+            <w:r/>
+            <w:r>
+              <w:rPr>
+                <w:rFonts w:ascii="Aptos" w:hAnsi="Aptos"/>
+                <w:b w:val="0"/>
+                <w:color w:val="172033"/>
+                <w:sz w:val="17"/>
+              </w:rPr>
+              <w:t>LSB</w:t>
+            </w:r>
+          </w:p>
+        </w:tc>
+        <w:tc>
+          <w:tcPr>
+            <w:tcW w:type="dxa" w:w="6552"/>
+            <w:vAlign w:val="center"/>
+            <w:shd w:fill="FFFFFF"/>
+          </w:tcPr>
+          <w:p>
+            <w:pPr>
+              <w:spacing w:after="40"/>
+            </w:pPr>
+            <w:r/>
+            <w:r>
+              <w:rPr>
+                <w:rFonts w:ascii="Aptos" w:hAnsi="Aptos"/>
+                <w:b w:val="0"/>
+                <w:color w:val="172033"/>
+                <w:sz w:val="17"/>
+              </w:rPr>
+              <w:t>Least-significant-bit embedding; fragile spatial-domain baseline.</w:t>
+            </w:r>
+          </w:p>
+        </w:tc>
+      </w:tr>
+      <w:tr>
+        <w:tc>
+          <w:tcPr>
+            <w:tcW w:type="dxa" w:w="2376"/>
+            <w:vAlign w:val="center"/>
+            <w:shd w:fill="F3F6F8"/>
+          </w:tcPr>
+          <w:p>
+            <w:pPr>
+              <w:spacing w:after="40"/>
+            </w:pPr>
+            <w:r/>
+            <w:r>
+              <w:rPr>
+                <w:rFonts w:ascii="Aptos" w:hAnsi="Aptos"/>
+                <w:b w:val="0"/>
+                <w:color w:val="172033"/>
+                <w:sz w:val="17"/>
+              </w:rPr>
+              <w:t>MSE</w:t>
+            </w:r>
+          </w:p>
+        </w:tc>
+        <w:tc>
+          <w:tcPr>
+            <w:tcW w:type="dxa" w:w="6552"/>
+            <w:vAlign w:val="center"/>
+            <w:shd w:fill="F3F6F8"/>
+          </w:tcPr>
+          <w:p>
+            <w:pPr>
+              <w:spacing w:after="40"/>
+            </w:pPr>
+            <w:r/>
+            <w:r>
+              <w:rPr>
+                <w:rFonts w:ascii="Aptos" w:hAnsi="Aptos"/>
+                <w:b w:val="0"/>
+                <w:color w:val="172033"/>
+                <w:sz w:val="17"/>
+              </w:rPr>
+              <w:t>Mean squared error; pixel-domain distortion measure.</w:t>
+            </w:r>
+          </w:p>
+        </w:tc>
+      </w:tr>
+      <w:tr>
+        <w:tc>
+          <w:tcPr>
+            <w:tcW w:type="dxa" w:w="2376"/>
+            <w:vAlign w:val="center"/>
+            <w:shd w:fill="FFFFFF"/>
+          </w:tcPr>
+          <w:p>
+            <w:pPr>
+              <w:spacing w:after="40"/>
+            </w:pPr>
+            <w:r/>
+            <w:r>
+              <w:rPr>
+                <w:rFonts w:ascii="Aptos" w:hAnsi="Aptos"/>
+                <w:b w:val="0"/>
+                <w:color w:val="172033"/>
+                <w:sz w:val="17"/>
+              </w:rPr>
+              <w:t>Payload</w:t>
+            </w:r>
+          </w:p>
+        </w:tc>
+        <w:tc>
+          <w:tcPr>
+            <w:tcW w:type="dxa" w:w="6552"/>
+            <w:vAlign w:val="center"/>
+            <w:shd w:fill="FFFFFF"/>
+          </w:tcPr>
+          <w:p>
+            <w:pPr>
+              <w:spacing w:after="40"/>
+            </w:pPr>
+            <w:r/>
+            <w:r>
+              <w:rPr>
+                <w:rFonts w:ascii="Aptos" w:hAnsi="Aptos"/>
+                <w:b w:val="0"/>
+                <w:color w:val="172033"/>
+                <w:sz w:val="17"/>
+              </w:rPr>
+              <w:t>Fixed test message embedded and recovered; not an identifier.</w:t>
+            </w:r>
+          </w:p>
+        </w:tc>
+      </w:tr>
+      <w:tr>
+        <w:tc>
+          <w:tcPr>
+            <w:tcW w:type="dxa" w:w="2376"/>
+            <w:vAlign w:val="center"/>
+            <w:shd w:fill="F3F6F8"/>
+          </w:tcPr>
+          <w:p>
+            <w:pPr>
+              <w:spacing w:after="40"/>
+            </w:pPr>
+            <w:r/>
+            <w:r>
+              <w:rPr>
+                <w:rFonts w:ascii="Aptos" w:hAnsi="Aptos"/>
+                <w:b w:val="0"/>
+                <w:color w:val="172033"/>
+                <w:sz w:val="17"/>
+              </w:rPr>
+              <w:t>Perceptual hash</w:t>
+            </w:r>
+          </w:p>
+        </w:tc>
+        <w:tc>
+          <w:tcPr>
+            <w:tcW w:type="dxa" w:w="6552"/>
+            <w:vAlign w:val="center"/>
+            <w:shd w:fill="F3F6F8"/>
+          </w:tcPr>
+          <w:p>
+            <w:pPr>
+              <w:spacing w:after="40"/>
+            </w:pPr>
+            <w:r/>
+            <w:r>
+              <w:rPr>
+                <w:rFonts w:ascii="Aptos" w:hAnsi="Aptos"/>
+                <w:b w:val="0"/>
+                <w:color w:val="172033"/>
+                <w:sz w:val="17"/>
+              </w:rPr>
+              <w:t>Compact content-derived representation compared by distance.</w:t>
+            </w:r>
+          </w:p>
+        </w:tc>
+      </w:tr>
+      <w:tr>
+        <w:tc>
+          <w:tcPr>
+            <w:tcW w:type="dxa" w:w="2376"/>
+            <w:vAlign w:val="center"/>
+            <w:shd w:fill="FFFFFF"/>
+          </w:tcPr>
+          <w:p>
+            <w:pPr>
+              <w:spacing w:after="40"/>
+            </w:pPr>
+            <w:r/>
+            <w:r>
+              <w:rPr>
+                <w:rFonts w:ascii="Aptos" w:hAnsi="Aptos"/>
+                <w:b w:val="0"/>
+                <w:color w:val="172033"/>
+                <w:sz w:val="17"/>
+              </w:rPr>
+              <w:t>pHash/dHash</w:t>
+            </w:r>
+          </w:p>
+        </w:tc>
+        <w:tc>
+          <w:tcPr>
+            <w:tcW w:type="dxa" w:w="6552"/>
+            <w:vAlign w:val="center"/>
+            <w:shd w:fill="FFFFFF"/>
+          </w:tcPr>
+          <w:p>
+            <w:pPr>
+              <w:spacing w:after="40"/>
+            </w:pPr>
+            <w:r/>
+            <w:r>
+              <w:rPr>
+                <w:rFonts w:ascii="Aptos" w:hAnsi="Aptos"/>
+                <w:b w:val="0"/>
+                <w:color w:val="172033"/>
+                <w:sz w:val="17"/>
+              </w:rPr>
+              <w:t>Specific perceptual hash variants (among eight tested).</w:t>
+            </w:r>
+          </w:p>
+        </w:tc>
+      </w:tr>
+      <w:tr>
+        <w:tc>
+          <w:tcPr>
+            <w:tcW w:type="dxa" w:w="2376"/>
+            <w:vAlign w:val="center"/>
+            <w:shd w:fill="F3F6F8"/>
+          </w:tcPr>
+          <w:p>
+            <w:pPr>
+              <w:spacing w:after="40"/>
+            </w:pPr>
+            <w:r/>
+            <w:r>
+              <w:rPr>
+                <w:rFonts w:ascii="Aptos" w:hAnsi="Aptos"/>
+                <w:b w:val="0"/>
+                <w:color w:val="172033"/>
+                <w:sz w:val="17"/>
+              </w:rPr>
+              <w:t>Provenance</w:t>
+            </w:r>
+          </w:p>
+        </w:tc>
+        <w:tc>
+          <w:tcPr>
+            <w:tcW w:type="dxa" w:w="6552"/>
+            <w:vAlign w:val="center"/>
+            <w:shd w:fill="F3F6F8"/>
+          </w:tcPr>
+          <w:p>
+            <w:pPr>
+              <w:spacing w:after="40"/>
+            </w:pPr>
+            <w:r/>
+            <w:r>
+              <w:rPr>
+                <w:rFonts w:ascii="Aptos" w:hAnsi="Aptos"/>
+                <w:b w:val="0"/>
+                <w:color w:val="172033"/>
+                <w:sz w:val="17"/>
+              </w:rPr>
+              <w:t>Signed, accountable record of claims; requires manifests and trust chain.</w:t>
+            </w:r>
+          </w:p>
+        </w:tc>
+      </w:tr>
+      <w:tr>
+        <w:tc>
+          <w:tcPr>
+            <w:tcW w:type="dxa" w:w="2376"/>
+            <w:vAlign w:val="center"/>
+            <w:shd w:fill="FFFFFF"/>
+          </w:tcPr>
+          <w:p>
+            <w:pPr>
+              <w:spacing w:after="40"/>
+            </w:pPr>
+            <w:r/>
+            <w:r>
+              <w:rPr>
+                <w:rFonts w:ascii="Aptos" w:hAnsi="Aptos"/>
+                <w:b w:val="0"/>
+                <w:color w:val="172033"/>
+                <w:sz w:val="17"/>
+              </w:rPr>
+              <w:t>PSNR</w:t>
+            </w:r>
+          </w:p>
+        </w:tc>
+        <w:tc>
+          <w:tcPr>
+            <w:tcW w:type="dxa" w:w="6552"/>
+            <w:vAlign w:val="center"/>
+            <w:shd w:fill="FFFFFF"/>
+          </w:tcPr>
+          <w:p>
+            <w:pPr>
+              <w:spacing w:after="40"/>
+            </w:pPr>
+            <w:r/>
+            <w:r>
+              <w:rPr>
+                <w:rFonts w:ascii="Aptos" w:hAnsi="Aptos"/>
+                <w:b w:val="0"/>
+                <w:color w:val="172033"/>
+                <w:sz w:val="17"/>
+              </w:rPr>
+              <w:t>Peak signal-to-noise ratio; imperceptibility metric, not robustness.</w:t>
+            </w:r>
+          </w:p>
+        </w:tc>
+      </w:tr>
+      <w:tr>
+        <w:tc>
+          <w:tcPr>
+            <w:tcW w:type="dxa" w:w="2376"/>
+            <w:vAlign w:val="center"/>
+            <w:shd w:fill="F3F6F8"/>
+          </w:tcPr>
+          <w:p>
+            <w:pPr>
+              <w:spacing w:after="40"/>
+            </w:pPr>
+            <w:r/>
+            <w:r>
+              <w:rPr>
+                <w:rFonts w:ascii="Aptos" w:hAnsi="Aptos"/>
+                <w:b w:val="0"/>
+                <w:color w:val="172033"/>
+                <w:sz w:val="17"/>
+              </w:rPr>
+              <w:t>Recovery</w:t>
+            </w:r>
+          </w:p>
+        </w:tc>
+        <w:tc>
+          <w:tcPr>
+            <w:tcW w:type="dxa" w:w="6552"/>
+            <w:vAlign w:val="center"/>
+            <w:shd w:fill="F3F6F8"/>
+          </w:tcPr>
+          <w:p>
+            <w:pPr>
+              <w:spacing w:after="40"/>
+            </w:pPr>
+            <w:r/>
+            <w:r>
+              <w:rPr>
+                <w:rFonts w:ascii="Aptos" w:hAnsi="Aptos"/>
+                <w:b w:val="0"/>
+                <w:color w:val="172033"/>
+                <w:sz w:val="17"/>
+              </w:rPr>
+              <w:t>Whether a payload decodes; see decode presence.</w:t>
+            </w:r>
+          </w:p>
+        </w:tc>
+      </w:tr>
+      <w:tr>
+        <w:tc>
+          <w:tcPr>
+            <w:tcW w:type="dxa" w:w="2376"/>
+            <w:vAlign w:val="center"/>
+            <w:shd w:fill="FFFFFF"/>
+          </w:tcPr>
+          <w:p>
+            <w:pPr>
+              <w:spacing w:after="40"/>
+            </w:pPr>
+            <w:r/>
+            <w:r>
+              <w:rPr>
+                <w:rFonts w:ascii="Aptos" w:hAnsi="Aptos"/>
+                <w:b w:val="0"/>
+                <w:color w:val="172033"/>
+                <w:sz w:val="17"/>
+              </w:rPr>
+              <w:t>TrustMark</w:t>
+            </w:r>
+          </w:p>
+        </w:tc>
+        <w:tc>
+          <w:tcPr>
+            <w:tcW w:type="dxa" w:w="6552"/>
+            <w:vAlign w:val="center"/>
+            <w:shd w:fill="FFFFFF"/>
+          </w:tcPr>
+          <w:p>
+            <w:pPr>
+              <w:spacing w:after="40"/>
+            </w:pPr>
+            <w:r/>
+            <w:r>
+              <w:rPr>
+                <w:rFonts w:ascii="Aptos" w:hAnsi="Aptos"/>
+                <w:b w:val="0"/>
+                <w:color w:val="172033"/>
+                <w:sz w:val="17"/>
+              </w:rPr>
+              <w:t>Learned neural watermark method used as primary candidate.</w:t>
+            </w:r>
+          </w:p>
+        </w:tc>
+      </w:tr>
+      <w:tr>
+        <w:tc>
+          <w:tcPr>
+            <w:tcW w:type="dxa" w:w="2376"/>
+            <w:vAlign w:val="center"/>
+            <w:shd w:fill="F3F6F8"/>
+          </w:tcPr>
+          <w:p>
+            <w:pPr>
+              <w:spacing w:after="40"/>
+            </w:pPr>
+            <w:r/>
+            <w:r>
+              <w:rPr>
+                <w:rFonts w:ascii="Aptos" w:hAnsi="Aptos"/>
+                <w:b w:val="0"/>
+                <w:color w:val="172033"/>
+                <w:sz w:val="17"/>
+              </w:rPr>
+              <w:t>Two-layer fallback</w:t>
+            </w:r>
+          </w:p>
+        </w:tc>
+        <w:tc>
+          <w:tcPr>
+            <w:tcW w:type="dxa" w:w="6552"/>
+            <w:vAlign w:val="center"/>
+            <w:shd w:fill="F3F6F8"/>
+          </w:tcPr>
+          <w:p>
+            <w:pPr>
+              <w:spacing w:after="40"/>
+            </w:pPr>
+            <w:r/>
+            <w:r>
+              <w:rPr>
+                <w:rFonts w:ascii="Aptos" w:hAnsi="Aptos"/>
+                <w:b w:val="0"/>
+                <w:color w:val="172033"/>
+                <w:sz w:val="17"/>
+              </w:rPr>
+              <w:t>Second BCH-coded DCT layer; recovery is TrustMark OR fallback.</w:t>
+            </w:r>
+          </w:p>
+        </w:tc>
+      </w:tr>
+      <w:tr>
+        <w:tc>
+          <w:tcPr>
+            <w:tcW w:type="dxa" w:w="2376"/>
+            <w:vAlign w:val="center"/>
+            <w:shd w:fill="FFFFFF"/>
+          </w:tcPr>
+          <w:p>
+            <w:pPr>
+              <w:spacing w:after="40"/>
+            </w:pPr>
+            <w:r/>
+            <w:r>
+              <w:rPr>
+                <w:rFonts w:ascii="Aptos" w:hAnsi="Aptos"/>
+                <w:b w:val="0"/>
+                <w:color w:val="172033"/>
+                <w:sz w:val="17"/>
+              </w:rPr>
+              <w:t>Transform intensity</w:t>
+            </w:r>
+          </w:p>
+        </w:tc>
+        <w:tc>
+          <w:tcPr>
+            <w:tcW w:type="dxa" w:w="6552"/>
+            <w:vAlign w:val="center"/>
+            <w:shd w:fill="FFFFFF"/>
+          </w:tcPr>
+          <w:p>
+            <w:pPr>
+              <w:spacing w:after="40"/>
+            </w:pPr>
+            <w:r/>
+            <w:r>
+              <w:rPr>
+                <w:rFonts w:ascii="Aptos" w:hAnsi="Aptos"/>
+                <w:b w:val="0"/>
+                <w:color w:val="172033"/>
+                <w:sz w:val="17"/>
+              </w:rPr>
+              <w:t>Parameter value of a named condition; comparable only within family.</w:t>
+            </w:r>
+          </w:p>
+        </w:tc>
+      </w:tr>
+    </w:tbl>
+    <w:p>
+      <w:pPr>
+        <w:spacing w:after="20"/>
+      </w:pPr>
+    </w:p>
     <w:sectPr>
       <w:headerReference w:type="default" r:id="rId9"/>
       <w:footerReference w:type="default" r:id="rId10"/>

</xml_diff>